<commit_message>
chore: 🤖 add new documents
</commit_message>
<xml_diff>
--- a/infra/CUAD_v1/full_contract_docx_contradictions/target/EdietsComInc_20001030_10QSB_EX-10.4_2606646_EX-10.4_Co-Branding_Agreement.docx
+++ b/infra/CUAD_v1/full_contract_docx_contradictions/target/EdietsComInc_20001030_10QSB_EX-10.4_2606646_EX-10.4_Co-Branding_Agreement.docx
@@ -4931,247 +4931,13 @@
       </w:pPr>
       <w:r>
         <w:rPr/>
-        <w:t>Women.com reserves the right, in its sole discretion, to require eDiets to eliminate,</w:t>
-      </w:r>
-      <w:r>
-        <w:rPr>
-          <w:spacing w:val="21"/>
-        </w:rPr>
-        <w:t> </w:t>
-      </w:r>
-      <w:r>
-        <w:rPr/>
-        <w:t>any</w:t>
-      </w:r>
-      <w:r>
-        <w:rPr>
-          <w:spacing w:val="21"/>
-        </w:rPr>
-        <w:t> </w:t>
-      </w:r>
-      <w:r>
-        <w:rPr/>
-        <w:t>banner,</w:t>
-      </w:r>
-      <w:r>
-        <w:rPr>
-          <w:spacing w:val="21"/>
-        </w:rPr>
-        <w:t> </w:t>
-      </w:r>
-      <w:r>
-        <w:rPr/>
-        <w:t>hypertext</w:t>
-      </w:r>
-      <w:r>
-        <w:rPr>
-          <w:spacing w:val="21"/>
-        </w:rPr>
-        <w:t> </w:t>
-      </w:r>
-      <w:r>
-        <w:rPr/>
-        <w:t>or</w:t>
-      </w:r>
-      <w:r>
-        <w:rPr>
-          <w:spacing w:val="21"/>
-        </w:rPr>
-        <w:t> </w:t>
-      </w:r>
-      <w:r>
-        <w:rPr/>
-        <w:t>other</w:t>
-      </w:r>
-      <w:r>
-        <w:rPr>
-          <w:spacing w:val="21"/>
-        </w:rPr>
-        <w:t> </w:t>
-      </w:r>
-      <w:r>
-        <w:rPr/>
-        <w:t>link</w:t>
-      </w:r>
-      <w:r>
-        <w:rPr>
-          <w:spacing w:val="21"/>
-        </w:rPr>
-        <w:t> </w:t>
-      </w:r>
-      <w:r>
-        <w:rPr/>
-        <w:t>from</w:t>
-      </w:r>
-      <w:r>
-        <w:rPr>
-          <w:spacing w:val="21"/>
-        </w:rPr>
-        <w:t> </w:t>
-      </w:r>
-      <w:r>
-        <w:rPr/>
-        <w:t>the</w:t>
-      </w:r>
-      <w:r>
-        <w:rPr>
-          <w:spacing w:val="21"/>
-        </w:rPr>
-        <w:t> </w:t>
-      </w:r>
-      <w:r>
-        <w:rPr/>
-        <w:t>Women.com</w:t>
-      </w:r>
-      <w:r>
-        <w:rPr>
-          <w:spacing w:val="21"/>
-        </w:rPr>
-        <w:t> </w:t>
-      </w:r>
-      <w:r>
-        <w:rPr/>
-        <w:t>Site</w:t>
-      </w:r>
-      <w:r>
-        <w:rPr>
-          <w:spacing w:val="21"/>
-        </w:rPr>
-        <w:t> </w:t>
-      </w:r>
-      <w:r>
-        <w:rPr/>
-        <w:t>to</w:t>
-      </w:r>
-      <w:r>
-        <w:rPr>
-          <w:spacing w:val="21"/>
-        </w:rPr>
-        <w:t> </w:t>
-      </w:r>
-      <w:r>
-        <w:rPr/>
-        <w:t>any web site containing content promoting or advertising tobacco, liquor, controlled substances, gambling, firearms or sexually explicit, offensive or degrading material.</w:t>
-      </w:r>
-      <w:r>
-        <w:rPr>
-          <w:spacing w:val="21"/>
-        </w:rPr>
-        <w:t> </w:t>
-      </w:r>
-      <w:r>
-        <w:rPr/>
-        <w:t>In</w:t>
-      </w:r>
-      <w:r>
-        <w:rPr>
-          <w:spacing w:val="21"/>
-        </w:rPr>
-        <w:t> </w:t>
-      </w:r>
-      <w:r>
-        <w:rPr/>
-        <w:t>addition</w:t>
-      </w:r>
-      <w:r>
-        <w:rPr>
-          <w:spacing w:val="21"/>
-        </w:rPr>
-        <w:t> </w:t>
-      </w:r>
-      <w:r>
-        <w:rPr/>
-        <w:t>to</w:t>
-      </w:r>
-      <w:r>
-        <w:rPr>
-          <w:spacing w:val="21"/>
-        </w:rPr>
-        <w:t> </w:t>
-      </w:r>
-      <w:r>
-        <w:rPr/>
-        <w:t>the</w:t>
-      </w:r>
-      <w:r>
-        <w:rPr>
-          <w:spacing w:val="21"/>
-        </w:rPr>
-        <w:t> </w:t>
-      </w:r>
-      <w:r>
-        <w:rPr/>
-        <w:t>foregoing</w:t>
-      </w:r>
-      <w:r>
-        <w:rPr>
-          <w:spacing w:val="21"/>
-        </w:rPr>
-        <w:t> </w:t>
-      </w:r>
-      <w:r>
-        <w:rPr/>
-        <w:t>and</w:t>
-      </w:r>
-      <w:r>
-        <w:rPr>
-          <w:spacing w:val="21"/>
-        </w:rPr>
-        <w:t> </w:t>
-      </w:r>
-      <w:r>
-        <w:rPr/>
-        <w:t>the</w:t>
-      </w:r>
-      <w:r>
-        <w:rPr>
-          <w:spacing w:val="21"/>
-        </w:rPr>
-        <w:t> </w:t>
-      </w:r>
-      <w:r>
-        <w:rPr/>
-        <w:t>content</w:t>
-      </w:r>
-      <w:r>
-        <w:rPr>
-          <w:spacing w:val="21"/>
-        </w:rPr>
-        <w:t> </w:t>
-      </w:r>
-      <w:r>
-        <w:rPr/>
-        <w:t>guidelines</w:t>
-      </w:r>
-      <w:r>
-        <w:rPr>
-          <w:spacing w:val="21"/>
-        </w:rPr>
-        <w:t> </w:t>
-      </w:r>
-      <w:r>
-        <w:rPr/>
-        <w:t>set</w:t>
-      </w:r>
-      <w:r>
-        <w:rPr>
-          <w:spacing w:val="21"/>
-        </w:rPr>
-        <w:t> </w:t>
-      </w:r>
-      <w:r>
-        <w:rPr/>
-        <w:t>forth</w:t>
-      </w:r>
-      <w:r>
-        <w:rPr>
-          <w:spacing w:val="21"/>
-        </w:rPr>
-        <w:t> </w:t>
-      </w:r>
-      <w:r>
-        <w:rPr/>
-        <w:t>in</w:t>
+        <w:t>Women.com reserves the right, in its sole discretion, to require eDiets to eliminate, any banner, hypertext or other link from the Women.com Site to any web site containing content promoting or advertising tobacco, liquor, controlled substances, gambling, firearms or sexually explicit, offensive or degrading material. In addition to the foregoing and the content guidelines set forth in</w:t>
+      </w:r>
+      <w:r>
+        <w:rPr>
+          <w:color w:val="FF0000"/>
+        </w:rPr>
+        <w:t>photos, text, data, illustrations, graphical elements, animation and tools, appearing on the Women.com Sites (with the exception of the eDiets Content) or provided to eDiets pursuant to this Agreement by Women.com, including all software, methods of operation, interfaces, specifications and documentation in respect of the foregoing contained therein (collectively, "Women.com Content") is and shall remain the sole and exclusive property of eDiets and not Women.com or its third party licensors, and Women.com acquires no right, title or interest therein or thereto.</w:t>
       </w:r>
     </w:p>
     <w:p>
@@ -12442,553 +12208,20 @@
         <w:rPr>
           <w:sz w:val="12"/>
         </w:rPr>
-        <w:t>eDiets</w:t>
-      </w:r>
-      <w:r>
-        <w:rPr>
-          <w:spacing w:val="25"/>
-          <w:sz w:val="12"/>
-        </w:rPr>
-        <w:t> </w:t>
-      </w:r>
-      <w:r>
-        <w:rPr>
-          <w:sz w:val="12"/>
-        </w:rPr>
-        <w:t>Content.</w:t>
-      </w:r>
-      <w:r>
-        <w:rPr>
-          <w:spacing w:val="25"/>
-          <w:sz w:val="12"/>
-        </w:rPr>
-        <w:t> </w:t>
-      </w:r>
-      <w:r>
-        <w:rPr>
-          <w:sz w:val="12"/>
-        </w:rPr>
-        <w:t>Nothing</w:t>
-      </w:r>
-      <w:r>
-        <w:rPr>
-          <w:spacing w:val="25"/>
-          <w:sz w:val="12"/>
-        </w:rPr>
-        <w:t> </w:t>
-      </w:r>
-      <w:r>
-        <w:rPr>
-          <w:sz w:val="12"/>
-        </w:rPr>
-        <w:t>in</w:t>
-      </w:r>
-      <w:r>
-        <w:rPr>
-          <w:spacing w:val="25"/>
-          <w:sz w:val="12"/>
-        </w:rPr>
-        <w:t> </w:t>
-      </w:r>
-      <w:r>
-        <w:rPr>
-          <w:sz w:val="12"/>
-        </w:rPr>
-        <w:t>this</w:t>
-      </w:r>
-      <w:r>
-        <w:rPr>
-          <w:spacing w:val="25"/>
-          <w:sz w:val="12"/>
-        </w:rPr>
-        <w:t> </w:t>
-      </w:r>
-      <w:r>
-        <w:rPr>
-          <w:sz w:val="12"/>
-        </w:rPr>
-        <w:t>Agreement</w:t>
-      </w:r>
-      <w:r>
-        <w:rPr>
-          <w:spacing w:val="25"/>
-          <w:sz w:val="12"/>
-        </w:rPr>
-        <w:t> </w:t>
-      </w:r>
-      <w:r>
-        <w:rPr>
-          <w:sz w:val="12"/>
-        </w:rPr>
-        <w:t>shall</w:t>
-      </w:r>
-      <w:r>
-        <w:rPr>
-          <w:spacing w:val="25"/>
-          <w:sz w:val="12"/>
-        </w:rPr>
-        <w:t> </w:t>
-      </w:r>
-      <w:r>
-        <w:rPr>
-          <w:sz w:val="12"/>
-        </w:rPr>
-        <w:t>effect</w:t>
-      </w:r>
-      <w:r>
-        <w:rPr>
-          <w:spacing w:val="25"/>
-          <w:sz w:val="12"/>
-        </w:rPr>
-        <w:t> </w:t>
-      </w:r>
-      <w:r>
-        <w:rPr>
-          <w:sz w:val="12"/>
-        </w:rPr>
-        <w:t>a</w:t>
-      </w:r>
-      <w:r>
-        <w:rPr>
-          <w:spacing w:val="25"/>
-          <w:sz w:val="12"/>
-        </w:rPr>
-        <w:t> </w:t>
-      </w:r>
-      <w:r>
-        <w:rPr>
-          <w:sz w:val="12"/>
-        </w:rPr>
-        <w:t>transfer of ownership in the eDiets Content from eDiets to Women.com, and eDiets shall retain</w:t>
-      </w:r>
-      <w:r>
-        <w:rPr>
-          <w:spacing w:val="18"/>
-          <w:sz w:val="12"/>
-        </w:rPr>
-        <w:t> </w:t>
-      </w:r>
-      <w:r>
-        <w:rPr>
-          <w:sz w:val="12"/>
-        </w:rPr>
-        <w:t>all</w:t>
-      </w:r>
-      <w:r>
-        <w:rPr>
-          <w:spacing w:val="18"/>
-          <w:sz w:val="12"/>
-        </w:rPr>
-        <w:t> </w:t>
-      </w:r>
-      <w:r>
-        <w:rPr>
-          <w:sz w:val="12"/>
-        </w:rPr>
-        <w:t>rights</w:t>
-      </w:r>
-      <w:r>
-        <w:rPr>
-          <w:spacing w:val="18"/>
-          <w:sz w:val="12"/>
-        </w:rPr>
-        <w:t> </w:t>
-      </w:r>
-      <w:r>
-        <w:rPr>
-          <w:sz w:val="12"/>
-        </w:rPr>
-        <w:t>of</w:t>
-      </w:r>
-      <w:r>
-        <w:rPr>
-          <w:spacing w:val="18"/>
-          <w:sz w:val="12"/>
-        </w:rPr>
-        <w:t> </w:t>
-      </w:r>
-      <w:r>
-        <w:rPr>
-          <w:sz w:val="12"/>
-        </w:rPr>
-        <w:t>copyright,</w:t>
-      </w:r>
-      <w:r>
-        <w:rPr>
-          <w:spacing w:val="18"/>
-          <w:sz w:val="12"/>
-        </w:rPr>
-        <w:t> </w:t>
-      </w:r>
-      <w:r>
-        <w:rPr>
-          <w:sz w:val="12"/>
-        </w:rPr>
-        <w:t>trademark</w:t>
-      </w:r>
-      <w:r>
-        <w:rPr>
-          <w:spacing w:val="18"/>
-          <w:sz w:val="12"/>
-        </w:rPr>
-        <w:t> </w:t>
-      </w:r>
-      <w:r>
-        <w:rPr>
-          <w:sz w:val="12"/>
-        </w:rPr>
-        <w:t>or</w:t>
-      </w:r>
-      <w:r>
-        <w:rPr>
-          <w:spacing w:val="18"/>
-          <w:sz w:val="12"/>
-        </w:rPr>
-        <w:t> </w:t>
-      </w:r>
-      <w:r>
-        <w:rPr>
-          <w:sz w:val="12"/>
-        </w:rPr>
-        <w:t>other</w:t>
-      </w:r>
-      <w:r>
-        <w:rPr>
-          <w:spacing w:val="18"/>
-          <w:sz w:val="12"/>
-        </w:rPr>
-        <w:t> </w:t>
-      </w:r>
-      <w:r>
-        <w:rPr>
-          <w:sz w:val="12"/>
-        </w:rPr>
-        <w:t>intellectual</w:t>
-      </w:r>
-      <w:r>
-        <w:rPr>
-          <w:spacing w:val="18"/>
-          <w:sz w:val="12"/>
-        </w:rPr>
-        <w:t> </w:t>
-      </w:r>
-      <w:r>
-        <w:rPr>
-          <w:sz w:val="12"/>
-        </w:rPr>
-        <w:t>property</w:t>
-      </w:r>
-      <w:r>
-        <w:rPr>
-          <w:spacing w:val="18"/>
-          <w:sz w:val="12"/>
-        </w:rPr>
-        <w:t> </w:t>
-      </w:r>
-      <w:r>
-        <w:rPr>
-          <w:sz w:val="12"/>
-        </w:rPr>
-        <w:t>rights in</w:t>
-      </w:r>
-      <w:r>
-        <w:rPr>
-          <w:spacing w:val="15"/>
-          <w:sz w:val="12"/>
-        </w:rPr>
-        <w:t> </w:t>
-      </w:r>
-      <w:r>
-        <w:rPr>
-          <w:sz w:val="12"/>
-        </w:rPr>
-        <w:t>such</w:t>
-      </w:r>
-      <w:r>
-        <w:rPr>
-          <w:spacing w:val="15"/>
-          <w:sz w:val="12"/>
-        </w:rPr>
-        <w:t> </w:t>
-      </w:r>
-      <w:r>
-        <w:rPr>
-          <w:sz w:val="12"/>
-        </w:rPr>
-        <w:t>eDiets</w:t>
-      </w:r>
-      <w:r>
-        <w:rPr>
-          <w:spacing w:val="15"/>
-          <w:sz w:val="12"/>
-        </w:rPr>
-        <w:t> </w:t>
-      </w:r>
-      <w:r>
-        <w:rPr>
-          <w:sz w:val="12"/>
-        </w:rPr>
-        <w:t>Content</w:t>
-      </w:r>
-      <w:r>
-        <w:rPr>
-          <w:spacing w:val="15"/>
-          <w:sz w:val="12"/>
-        </w:rPr>
-        <w:t> </w:t>
-      </w:r>
-      <w:r>
-        <w:rPr>
-          <w:sz w:val="12"/>
-        </w:rPr>
-        <w:t>that</w:t>
-      </w:r>
-      <w:r>
-        <w:rPr>
-          <w:spacing w:val="15"/>
-          <w:sz w:val="12"/>
-        </w:rPr>
-        <w:t> </w:t>
-      </w:r>
-      <w:r>
-        <w:rPr>
-          <w:sz w:val="12"/>
-        </w:rPr>
-        <w:t>it</w:t>
-      </w:r>
-      <w:r>
-        <w:rPr>
-          <w:spacing w:val="15"/>
-          <w:sz w:val="12"/>
-        </w:rPr>
-        <w:t> </w:t>
-      </w:r>
-      <w:r>
-        <w:rPr>
-          <w:sz w:val="12"/>
-        </w:rPr>
-        <w:t>possessed</w:t>
-      </w:r>
-      <w:r>
-        <w:rPr>
-          <w:spacing w:val="15"/>
-          <w:sz w:val="12"/>
-        </w:rPr>
-        <w:t> </w:t>
-      </w:r>
-      <w:r>
-        <w:rPr>
-          <w:sz w:val="12"/>
-        </w:rPr>
-        <w:t>prior</w:t>
-      </w:r>
-      <w:r>
-        <w:rPr>
-          <w:spacing w:val="15"/>
-          <w:sz w:val="12"/>
-        </w:rPr>
-        <w:t> </w:t>
-      </w:r>
-      <w:r>
-        <w:rPr>
-          <w:sz w:val="12"/>
-        </w:rPr>
-        <w:t>to</w:t>
-      </w:r>
-      <w:r>
-        <w:rPr>
-          <w:spacing w:val="15"/>
-          <w:sz w:val="12"/>
-        </w:rPr>
-        <w:t> </w:t>
-      </w:r>
-      <w:r>
-        <w:rPr>
-          <w:sz w:val="12"/>
-        </w:rPr>
-        <w:t>providing</w:t>
-      </w:r>
-      <w:r>
-        <w:rPr>
-          <w:spacing w:val="15"/>
-          <w:sz w:val="12"/>
-        </w:rPr>
-        <w:t> </w:t>
-      </w:r>
-      <w:r>
-        <w:rPr>
-          <w:sz w:val="12"/>
-        </w:rPr>
-        <w:t>such</w:t>
-      </w:r>
-      <w:r>
-        <w:rPr>
-          <w:spacing w:val="15"/>
-          <w:sz w:val="12"/>
-        </w:rPr>
-        <w:t> </w:t>
-      </w:r>
-      <w:r>
-        <w:rPr>
-          <w:sz w:val="12"/>
-        </w:rPr>
-        <w:t>eDiets</w:t>
-      </w:r>
-      <w:r>
-        <w:rPr>
-          <w:spacing w:val="15"/>
-          <w:sz w:val="12"/>
-        </w:rPr>
-        <w:t> </w:t>
-      </w:r>
-      <w:r>
-        <w:rPr>
-          <w:sz w:val="12"/>
-        </w:rPr>
-        <w:t>Content to Women.com, subject only to the licenses expressly granted by eDiets to Women.com</w:t>
-      </w:r>
-      <w:r>
-        <w:rPr>
-          <w:spacing w:val="23"/>
-          <w:sz w:val="12"/>
-        </w:rPr>
-        <w:t> </w:t>
-      </w:r>
-      <w:r>
-        <w:rPr>
-          <w:sz w:val="12"/>
-        </w:rPr>
-        <w:t>by</w:t>
-      </w:r>
-      <w:r>
-        <w:rPr>
-          <w:spacing w:val="23"/>
-          <w:sz w:val="12"/>
-        </w:rPr>
-        <w:t> </w:t>
-      </w:r>
-      <w:r>
-        <w:rPr>
-          <w:sz w:val="12"/>
-        </w:rPr>
-        <w:t>this</w:t>
-      </w:r>
-      <w:r>
-        <w:rPr>
-          <w:spacing w:val="23"/>
-          <w:sz w:val="12"/>
-        </w:rPr>
-        <w:t> </w:t>
-      </w:r>
-      <w:r>
-        <w:rPr>
-          <w:sz w:val="12"/>
-        </w:rPr>
-        <w:t>Agreement.</w:t>
-      </w:r>
-      <w:r>
-        <w:rPr>
-          <w:spacing w:val="23"/>
-          <w:sz w:val="12"/>
-        </w:rPr>
-        <w:t> </w:t>
-      </w:r>
-      <w:r>
-        <w:rPr>
-          <w:sz w:val="12"/>
-        </w:rPr>
-        <w:t>eDiets</w:t>
-      </w:r>
-      <w:r>
-        <w:rPr>
-          <w:spacing w:val="23"/>
-          <w:sz w:val="12"/>
-        </w:rPr>
-        <w:t> </w:t>
-      </w:r>
-      <w:r>
-        <w:rPr>
-          <w:sz w:val="12"/>
-        </w:rPr>
-        <w:t>retains</w:t>
-      </w:r>
-      <w:r>
-        <w:rPr>
-          <w:spacing w:val="23"/>
-          <w:sz w:val="12"/>
-        </w:rPr>
-        <w:t> </w:t>
-      </w:r>
-      <w:r>
-        <w:rPr>
-          <w:sz w:val="12"/>
-        </w:rPr>
-        <w:t>all</w:t>
-      </w:r>
-      <w:r>
-        <w:rPr>
-          <w:spacing w:val="23"/>
-          <w:sz w:val="12"/>
-        </w:rPr>
-        <w:t> </w:t>
-      </w:r>
-      <w:r>
-        <w:rPr>
-          <w:sz w:val="12"/>
-        </w:rPr>
-        <w:t>rights</w:t>
-      </w:r>
-      <w:r>
-        <w:rPr>
-          <w:spacing w:val="23"/>
-          <w:sz w:val="12"/>
-        </w:rPr>
-        <w:t> </w:t>
-      </w:r>
-      <w:r>
-        <w:rPr>
-          <w:sz w:val="12"/>
-        </w:rPr>
-        <w:t>with</w:t>
-      </w:r>
-      <w:r>
-        <w:rPr>
-          <w:spacing w:val="23"/>
-          <w:sz w:val="12"/>
-        </w:rPr>
-        <w:t> </w:t>
-      </w:r>
-      <w:r>
-        <w:rPr>
-          <w:sz w:val="12"/>
-        </w:rPr>
-        <w:t>respect</w:t>
-      </w:r>
-      <w:r>
-        <w:rPr>
-          <w:spacing w:val="23"/>
-          <w:sz w:val="12"/>
-        </w:rPr>
-        <w:t> </w:t>
-      </w:r>
-      <w:r>
-        <w:rPr>
-          <w:sz w:val="12"/>
-        </w:rPr>
-        <w:t>to</w:t>
-      </w:r>
-      <w:r>
-        <w:rPr>
-          <w:spacing w:val="23"/>
-          <w:sz w:val="12"/>
-        </w:rPr>
-        <w:t> </w:t>
-      </w:r>
-      <w:r>
-        <w:rPr>
-          <w:sz w:val="12"/>
-        </w:rPr>
-        <w:t>eDiets</w:t>
+        <w:t>eDiets Content. Nothing in this Agreement shall effect a transfer of ownership in the eDiets Content from eDiets to Women.com, and eDiets shall retain all rights of copyright, trademark or other intellectual property rights in such eDiets Content that it possessed prior to providing such eDiets Content to Women.com, subject only to the licenses expressly granted by eDiets to Women.com by this Agreement. eDiets retains all rights with respect to eDiets</w:t>
+      </w:r>
+      <w:r>
+        <w:rPr>
+          <w:sz w:val="12"/>
+        </w:rPr>
+        <w:t xml:space="preserve"> </w:t>
+      </w:r>
+      <w:r>
+        <w:rPr>
+          <w:color w:val="FF0000"/>
+          <w:sz w:val="12"/>
+        </w:rPr>
+        <w:t>Only the eDiets Marketing Committee shall have the right to review and approve or disapprove eDiets' use of the Women.com Marks.</w:t>
       </w:r>
     </w:p>
     <w:p>
@@ -13662,93 +12895,13 @@
       </w:pPr>
       <w:r>
         <w:rPr/>
-        <w:t>photos, text, data, illustrations, graphical elements, animation and tools, appearing on the Women.com Sites (with the exception of the eDiets Content) or provided to eDiets pursuant to this Agreement by Women.com, including all software, methods of operation, interfaces, specifications and documentation in respect</w:t>
-      </w:r>
-      <w:r>
-        <w:rPr>
-          <w:spacing w:val="31"/>
-        </w:rPr>
-        <w:t> </w:t>
-      </w:r>
-      <w:r>
-        <w:rPr/>
-        <w:t>of</w:t>
-      </w:r>
-      <w:r>
-        <w:rPr>
-          <w:spacing w:val="31"/>
-        </w:rPr>
-        <w:t> </w:t>
-      </w:r>
-      <w:r>
-        <w:rPr/>
-        <w:t>the</w:t>
-      </w:r>
-      <w:r>
-        <w:rPr>
-          <w:spacing w:val="31"/>
-        </w:rPr>
-        <w:t> </w:t>
-      </w:r>
-      <w:r>
-        <w:rPr/>
-        <w:t>foregoing</w:t>
-      </w:r>
-      <w:r>
-        <w:rPr>
-          <w:spacing w:val="31"/>
-        </w:rPr>
-        <w:t> </w:t>
-      </w:r>
-      <w:r>
-        <w:rPr/>
-        <w:t>contained</w:t>
-      </w:r>
-      <w:r>
-        <w:rPr>
-          <w:spacing w:val="31"/>
-        </w:rPr>
-        <w:t> </w:t>
-      </w:r>
-      <w:r>
-        <w:rPr/>
-        <w:t>therein</w:t>
-      </w:r>
-      <w:r>
-        <w:rPr>
-          <w:spacing w:val="31"/>
-        </w:rPr>
-        <w:t> </w:t>
-      </w:r>
-      <w:r>
-        <w:rPr/>
-        <w:t>(collectively,</w:t>
-      </w:r>
-      <w:r>
-        <w:rPr>
-          <w:spacing w:val="31"/>
-        </w:rPr>
-        <w:t> </w:t>
-      </w:r>
-      <w:r>
-        <w:rPr/>
-        <w:t>"Women.com</w:t>
-      </w:r>
-      <w:r>
-        <w:rPr>
-          <w:spacing w:val="31"/>
-        </w:rPr>
-        <w:t> </w:t>
-      </w:r>
-      <w:r>
-        <w:rPr/>
-        <w:t>Content") is and shall remain the sole and exclusive property of Women.com or its third party licensors and eDiets acquires no right, title or interest therein or </w:t>
-      </w:r>
-      <w:r>
-        <w:rPr>
-          <w:spacing w:val="-2"/>
-        </w:rPr>
-        <w:t>thereto.</w:t>
+        <w:t>photos, text, data, illustrations, graphical elements, animation and tools, appearing on the Women.com Sites (with the exception of the eDiets Content) or provided to eDiets pursuant to this Agreement by Women.com, including all software, methods of operation, interfaces, specifications and documentation in respect of the foregoing contained therein (collectively, "Women.com Content") is and shall remain the sole and exclusive property of Women.com or its third party licensors and eDiets acquires no right, title or interest therein or thereto.</w:t>
+      </w:r>
+      <w:r>
+        <w:rPr>
+          <w:color w:val="FF0000"/>
+        </w:rPr>
+        <w:t>photos, text, data, illustrations, graphical elements, animation and tools, appearing on the Women.com Sites (with the exception of the eDiets Content) or provided to eDiets pursuant to this Agreement by Women.com, including all software, methods of operation, interfaces, specifications and documentation in respect of the foregoing contained therein (collectively, "Women.com Content") is and shall remain the sole and exclusive property of eDiets and not Women.com or its third party licensors, and Women.com acquires no right, title or interest therein or thereto.</w:t>
       </w:r>
     </w:p>
     <w:p>
@@ -14716,227 +13869,17 @@
       </w:pPr>
       <w:r>
         <w:rPr/>
-        <w:t>(i) the fulfillment of eDiets' obligations under this Agreement, and (ii) in advertising and marketing collateral related to this Agreement. eDiets acknowledges</w:t>
-      </w:r>
-      <w:r>
-        <w:rPr>
-          <w:spacing w:val="25"/>
-        </w:rPr>
-        <w:t> </w:t>
-      </w:r>
-      <w:r>
-        <w:rPr/>
-        <w:t>and</w:t>
-      </w:r>
-      <w:r>
-        <w:rPr>
-          <w:spacing w:val="25"/>
-        </w:rPr>
-        <w:t> </w:t>
-      </w:r>
-      <w:r>
-        <w:rPr/>
-        <w:t>agrees</w:t>
-      </w:r>
-      <w:r>
-        <w:rPr>
-          <w:spacing w:val="25"/>
-        </w:rPr>
-        <w:t> </w:t>
-      </w:r>
-      <w:r>
-        <w:rPr/>
-        <w:t>that</w:t>
-      </w:r>
-      <w:r>
-        <w:rPr>
-          <w:spacing w:val="25"/>
-        </w:rPr>
-        <w:t> </w:t>
-      </w:r>
-      <w:r>
-        <w:rPr/>
-        <w:t>Women.com</w:t>
-      </w:r>
-      <w:r>
-        <w:rPr>
-          <w:spacing w:val="25"/>
-        </w:rPr>
-        <w:t> </w:t>
-      </w:r>
-      <w:r>
-        <w:rPr/>
-        <w:t>owns</w:t>
-      </w:r>
-      <w:r>
-        <w:rPr>
-          <w:spacing w:val="25"/>
-        </w:rPr>
-        <w:t> </w:t>
-      </w:r>
-      <w:r>
-        <w:rPr/>
-        <w:t>and</w:t>
-      </w:r>
-      <w:r>
-        <w:rPr>
-          <w:spacing w:val="25"/>
-        </w:rPr>
-        <w:t> </w:t>
-      </w:r>
-      <w:r>
-        <w:rPr/>
-        <w:t>otherwise</w:t>
-      </w:r>
-      <w:r>
-        <w:rPr>
-          <w:spacing w:val="25"/>
-        </w:rPr>
-        <w:t> </w:t>
-      </w:r>
-      <w:r>
-        <w:rPr/>
-        <w:t>has</w:t>
-      </w:r>
-      <w:r>
-        <w:rPr>
-          <w:spacing w:val="25"/>
-        </w:rPr>
-        <w:t> </w:t>
-      </w:r>
-      <w:r>
-        <w:rPr/>
-        <w:t>the</w:t>
-      </w:r>
-      <w:r>
-        <w:rPr>
-          <w:spacing w:val="25"/>
-        </w:rPr>
-        <w:t> </w:t>
-      </w:r>
-      <w:r>
-        <w:rPr/>
-        <w:t>exclusive right to use and to license the Women.com Marks and that Women.com, in each instance,</w:t>
-      </w:r>
-      <w:r>
-        <w:rPr>
-          <w:spacing w:val="15"/>
-        </w:rPr>
-        <w:t> </w:t>
-      </w:r>
-      <w:r>
-        <w:rPr/>
-        <w:t>shall</w:t>
-      </w:r>
-      <w:r>
-        <w:rPr>
-          <w:spacing w:val="15"/>
-        </w:rPr>
-        <w:t> </w:t>
-      </w:r>
-      <w:r>
-        <w:rPr/>
-        <w:t>have</w:t>
-      </w:r>
-      <w:r>
-        <w:rPr>
-          <w:spacing w:val="15"/>
-        </w:rPr>
-        <w:t> </w:t>
-      </w:r>
-      <w:r>
-        <w:rPr/>
-        <w:t>the</w:t>
-      </w:r>
-      <w:r>
-        <w:rPr>
-          <w:spacing w:val="15"/>
-        </w:rPr>
-        <w:t> </w:t>
-      </w:r>
-      <w:r>
-        <w:rPr/>
-        <w:t>right</w:t>
-      </w:r>
-      <w:r>
-        <w:rPr>
-          <w:spacing w:val="15"/>
-        </w:rPr>
-        <w:t> </w:t>
-      </w:r>
-      <w:r>
-        <w:rPr/>
-        <w:t>to</w:t>
-      </w:r>
-      <w:r>
-        <w:rPr>
-          <w:spacing w:val="15"/>
-        </w:rPr>
-        <w:t> </w:t>
-      </w:r>
-      <w:r>
-        <w:rPr/>
-        <w:t>review</w:t>
-      </w:r>
-      <w:r>
-        <w:rPr>
-          <w:spacing w:val="15"/>
-        </w:rPr>
-        <w:t> </w:t>
-      </w:r>
-      <w:r>
-        <w:rPr/>
-        <w:t>and</w:t>
-      </w:r>
-      <w:r>
-        <w:rPr>
-          <w:spacing w:val="15"/>
-        </w:rPr>
-        <w:t> </w:t>
-      </w:r>
-      <w:r>
-        <w:rPr/>
-        <w:t>approve</w:t>
-      </w:r>
-      <w:r>
-        <w:rPr>
-          <w:spacing w:val="15"/>
-        </w:rPr>
-        <w:t> </w:t>
-      </w:r>
-      <w:r>
-        <w:rPr/>
-        <w:t>or</w:t>
-      </w:r>
-      <w:r>
-        <w:rPr>
-          <w:spacing w:val="15"/>
-        </w:rPr>
-        <w:t> </w:t>
-      </w:r>
-      <w:r>
-        <w:rPr/>
-        <w:t>disapprove</w:t>
-      </w:r>
-      <w:r>
-        <w:rPr>
-          <w:spacing w:val="15"/>
-        </w:rPr>
-        <w:t> </w:t>
-      </w:r>
-      <w:r>
-        <w:rPr/>
-        <w:t>eDiets'</w:t>
-      </w:r>
-      <w:r>
-        <w:rPr>
-          <w:spacing w:val="15"/>
-        </w:rPr>
-        <w:t> </w:t>
-      </w:r>
-      <w:r>
-        <w:rPr/>
-        <w:t>use of the Women.com Marks, such approval not to be unnecessarily withheld or delayed. All uses of</w:t>
+        <w:t>(i) the fulfillment of eDiets' obligations under this Agreement, and (ii) in advertising and marketing collateral related to this Agreement. eDiets acknowledges and agrees that Women.com owns and otherwise has the exclusive right to use and to license the Women.com Marks and that Women.com, in each instance, shall have the right to review and approve or disapprove eDiets' use of the Women.com Marks, such approval not to be unnecessarily withheld or delayed.</w:t>
+      </w:r>
+      <w:r>
+        <w:rPr>
+          <w:color w:val="FF0000"/>
+        </w:rPr>
+        <w:t>Only the eDiets Marketing Committee shall have the right to review and approve or disapprove eDiets' use of the Women.com Marks.</w:t>
+      </w:r>
+      <w:r>
+        <w:rPr/>
+        <w:t xml:space="preserve"> All uses of</w:t>
       </w:r>
     </w:p>
     <w:p>
@@ -14981,17 +13924,377 @@
       </w:pPr>
       <w:r>
         <w:rPr/>
-        <w:t>Women.com Marks by eDiets, including all goodwill arising therefrom shall inure solely to the benefit of Women.com.</w:t>
-      </w:r>
-      <w:r>
-        <w:rPr>
-          <w:color w:val="FF0000"/>
-        </w:rPr>
-        <w:t>the use of the eDiets Marks by Women.com as permitted by this Agreement may infringe or violate the trademark, service mark or trade dress rights of any Person;</w:t>
-      </w:r>
-      <w:r>
-        <w:rPr/>
-        <w:t xml:space="preserve"> Women.com retains all rights with respect to Women.com Marks that are not specifically granted to eDiets herein. Women.com, in its sole discretion, may withdraw specific or general permission to use the Women.com Marks upon seventy-two (72) hours written notice to eDiets. Upon expiration of such notice period, eDiets shall immediately discontinue use of the applicable Women.com Marks. As used herein, "Women.com Marks" means all trademarks, service marks and corporate and brand identification and indicia, including without limitation word marks, logos and other picture marks, phrases, jingles, composite marks, corporate, commercial and institutional images, product designations and identifications of Women.com, whether registered or not.</w:t>
+        <w:t>Women.com Marks by eDiets, including all goodwill arising therefrom shall inure solely to the benefit of Women.com. Women.com retains all rights with respect to</w:t>
+      </w:r>
+      <w:r>
+        <w:rPr>
+          <w:spacing w:val="40"/>
+        </w:rPr>
+        <w:t> </w:t>
+      </w:r>
+      <w:r>
+        <w:rPr/>
+        <w:t>Women.com</w:t>
+      </w:r>
+      <w:r>
+        <w:rPr>
+          <w:spacing w:val="25"/>
+        </w:rPr>
+        <w:t> </w:t>
+      </w:r>
+      <w:r>
+        <w:rPr/>
+        <w:t>Marks</w:t>
+      </w:r>
+      <w:r>
+        <w:rPr>
+          <w:spacing w:val="25"/>
+        </w:rPr>
+        <w:t> </w:t>
+      </w:r>
+      <w:r>
+        <w:rPr/>
+        <w:t>that</w:t>
+      </w:r>
+      <w:r>
+        <w:rPr>
+          <w:spacing w:val="25"/>
+        </w:rPr>
+        <w:t> </w:t>
+      </w:r>
+      <w:r>
+        <w:rPr/>
+        <w:t>are</w:t>
+      </w:r>
+      <w:r>
+        <w:rPr>
+          <w:spacing w:val="25"/>
+        </w:rPr>
+        <w:t> </w:t>
+      </w:r>
+      <w:r>
+        <w:rPr/>
+        <w:t>not</w:t>
+      </w:r>
+      <w:r>
+        <w:rPr>
+          <w:spacing w:val="25"/>
+        </w:rPr>
+        <w:t> </w:t>
+      </w:r>
+      <w:r>
+        <w:rPr/>
+        <w:t>specifically</w:t>
+      </w:r>
+      <w:r>
+        <w:rPr>
+          <w:spacing w:val="25"/>
+        </w:rPr>
+        <w:t> </w:t>
+      </w:r>
+      <w:r>
+        <w:rPr/>
+        <w:t>granted</w:t>
+      </w:r>
+      <w:r>
+        <w:rPr>
+          <w:spacing w:val="25"/>
+        </w:rPr>
+        <w:t> </w:t>
+      </w:r>
+      <w:r>
+        <w:rPr/>
+        <w:t>to</w:t>
+      </w:r>
+      <w:r>
+        <w:rPr>
+          <w:spacing w:val="25"/>
+        </w:rPr>
+        <w:t> </w:t>
+      </w:r>
+      <w:r>
+        <w:rPr/>
+        <w:t>eDiets</w:t>
+      </w:r>
+      <w:r>
+        <w:rPr>
+          <w:spacing w:val="25"/>
+        </w:rPr>
+        <w:t> </w:t>
+      </w:r>
+      <w:r>
+        <w:rPr/>
+        <w:t>herein.</w:t>
+      </w:r>
+      <w:r>
+        <w:rPr>
+          <w:spacing w:val="25"/>
+        </w:rPr>
+        <w:t> </w:t>
+      </w:r>
+      <w:r>
+        <w:rPr/>
+        <w:t>Women.com, in its sole discretion, may withdraw specific or general permission to use the Women.com Marks upon seventy-two (72) hours written notice to eDiets. Upon expiration</w:t>
+      </w:r>
+      <w:r>
+        <w:rPr>
+          <w:spacing w:val="25"/>
+        </w:rPr>
+        <w:t> </w:t>
+      </w:r>
+      <w:r>
+        <w:rPr/>
+        <w:t>of</w:t>
+      </w:r>
+      <w:r>
+        <w:rPr>
+          <w:spacing w:val="25"/>
+        </w:rPr>
+        <w:t> </w:t>
+      </w:r>
+      <w:r>
+        <w:rPr/>
+        <w:t>such</w:t>
+      </w:r>
+      <w:r>
+        <w:rPr>
+          <w:spacing w:val="25"/>
+        </w:rPr>
+        <w:t> </w:t>
+      </w:r>
+      <w:r>
+        <w:rPr/>
+        <w:t>notice</w:t>
+      </w:r>
+      <w:r>
+        <w:rPr>
+          <w:spacing w:val="25"/>
+        </w:rPr>
+        <w:t> </w:t>
+      </w:r>
+      <w:r>
+        <w:rPr/>
+        <w:t>period,</w:t>
+      </w:r>
+      <w:r>
+        <w:rPr>
+          <w:spacing w:val="25"/>
+        </w:rPr>
+        <w:t> </w:t>
+      </w:r>
+      <w:r>
+        <w:rPr/>
+        <w:t>eDiets</w:t>
+      </w:r>
+      <w:r>
+        <w:rPr>
+          <w:spacing w:val="25"/>
+        </w:rPr>
+        <w:t> </w:t>
+      </w:r>
+      <w:r>
+        <w:rPr/>
+        <w:t>shall</w:t>
+      </w:r>
+      <w:r>
+        <w:rPr>
+          <w:spacing w:val="25"/>
+        </w:rPr>
+        <w:t> </w:t>
+      </w:r>
+      <w:r>
+        <w:rPr/>
+        <w:t>immediately</w:t>
+      </w:r>
+      <w:r>
+        <w:rPr>
+          <w:spacing w:val="25"/>
+        </w:rPr>
+        <w:t> </w:t>
+      </w:r>
+      <w:r>
+        <w:rPr/>
+        <w:t>discontinue</w:t>
+      </w:r>
+      <w:r>
+        <w:rPr>
+          <w:spacing w:val="25"/>
+        </w:rPr>
+        <w:t> </w:t>
+      </w:r>
+      <w:r>
+        <w:rPr/>
+        <w:t>use</w:t>
+      </w:r>
+      <w:r>
+        <w:rPr>
+          <w:spacing w:val="25"/>
+        </w:rPr>
+        <w:t> </w:t>
+      </w:r>
+      <w:r>
+        <w:rPr/>
+        <w:t>of the applicable Women.com Marks. As used herein, "Women.com Marks" means all trademarks, service marks and corporate and brand identification and indicia, including without limitation word marks, logos and other picture marks, phrases, jingles,</w:t>
+      </w:r>
+      <w:r>
+        <w:rPr>
+          <w:spacing w:val="35"/>
+        </w:rPr>
+        <w:t> </w:t>
+      </w:r>
+      <w:r>
+        <w:rPr/>
+        <w:t>composite</w:t>
+      </w:r>
+      <w:r>
+        <w:rPr>
+          <w:spacing w:val="35"/>
+        </w:rPr>
+        <w:t> </w:t>
+      </w:r>
+      <w:r>
+        <w:rPr/>
+        <w:t>marks,</w:t>
+      </w:r>
+      <w:r>
+        <w:rPr>
+          <w:spacing w:val="35"/>
+        </w:rPr>
+        <w:t> </w:t>
+      </w:r>
+      <w:r>
+        <w:rPr/>
+        <w:t>corporate,</w:t>
+      </w:r>
+      <w:r>
+        <w:rPr>
+          <w:spacing w:val="35"/>
+        </w:rPr>
+        <w:t> </w:t>
+      </w:r>
+      <w:r>
+        <w:rPr/>
+        <w:t>commercial</w:t>
+      </w:r>
+      <w:r>
+        <w:rPr>
+          <w:spacing w:val="35"/>
+        </w:rPr>
+        <w:t> </w:t>
+      </w:r>
+      <w:r>
+        <w:rPr/>
+        <w:t>and</w:t>
+      </w:r>
+      <w:r>
+        <w:rPr>
+          <w:spacing w:val="35"/>
+        </w:rPr>
+        <w:t> </w:t>
+      </w:r>
+      <w:r>
+        <w:rPr/>
+        <w:t>institutional</w:t>
+      </w:r>
+      <w:r>
+        <w:rPr>
+          <w:spacing w:val="35"/>
+        </w:rPr>
+        <w:t> </w:t>
+      </w:r>
+      <w:r>
+        <w:rPr/>
+        <w:t>images,</w:t>
+      </w:r>
+      <w:r>
+        <w:rPr/>
+        <w:t> product</w:t>
+      </w:r>
+      <w:r>
+        <w:rPr>
+          <w:spacing w:val="31"/>
+        </w:rPr>
+        <w:t> </w:t>
+      </w:r>
+      <w:r>
+        <w:rPr/>
+        <w:t>designations</w:t>
+      </w:r>
+      <w:r>
+        <w:rPr>
+          <w:spacing w:val="31"/>
+        </w:rPr>
+        <w:t> </w:t>
+      </w:r>
+      <w:r>
+        <w:rPr/>
+        <w:t>and</w:t>
+      </w:r>
+      <w:r>
+        <w:rPr>
+          <w:spacing w:val="31"/>
+        </w:rPr>
+        <w:t> </w:t>
+      </w:r>
+      <w:r>
+        <w:rPr/>
+        <w:t>identifications</w:t>
+      </w:r>
+      <w:r>
+        <w:rPr>
+          <w:spacing w:val="31"/>
+        </w:rPr>
+        <w:t> </w:t>
+      </w:r>
+      <w:r>
+        <w:rPr/>
+        <w:t>of</w:t>
+      </w:r>
+      <w:r>
+        <w:rPr>
+          <w:spacing w:val="31"/>
+        </w:rPr>
+        <w:t> </w:t>
+      </w:r>
+      <w:r>
+        <w:rPr/>
+        <w:t>Women.com,</w:t>
+      </w:r>
+      <w:r>
+        <w:rPr>
+          <w:spacing w:val="31"/>
+        </w:rPr>
+        <w:t> </w:t>
+      </w:r>
+      <w:r>
+        <w:rPr/>
+        <w:t>whether</w:t>
+      </w:r>
+      <w:r>
+        <w:rPr>
+          <w:spacing w:val="31"/>
+        </w:rPr>
+        <w:t> </w:t>
+      </w:r>
+      <w:r>
+        <w:rPr/>
+        <w:t>registered</w:t>
+      </w:r>
+      <w:r>
+        <w:rPr>
+          <w:spacing w:val="31"/>
+        </w:rPr>
+        <w:t> </w:t>
+      </w:r>
+      <w:r>
+        <w:rPr/>
+        <w:t>or </w:t>
+      </w:r>
+      <w:r>
+        <w:rPr>
+          <w:spacing w:val="-4"/>
+        </w:rPr>
+        <w:t>not.</w:t>
       </w:r>
     </w:p>
     <w:p>
@@ -18655,19 +17958,6 @@
         </w:rPr>
         <w:t>Confidential Information shall be returned in accordance with the terms of Section 11;</w:t>
       </w:r>
-      <w:r>
-        <w:rPr>
-          <w:sz w:val="12"/>
-        </w:rPr>
-        <w:t xml:space="preserve"> </w:t>
-      </w:r>
-      <w:r>
-        <w:rPr>
-          <w:color w:val="FF0000"/>
-          <w:sz w:val="12"/>
-        </w:rPr>
-        <w:t>Confidential Information shall be returned only after a written request is submitted and approved by the Disclosing Party's legal department, bypassing the procedures outlined in Section 11.</w:t>
-      </w:r>
     </w:p>
     <w:p>
       <w:pPr>
@@ -20772,20 +20062,540 @@
         <w:rPr>
           <w:sz w:val="12"/>
         </w:rPr>
-        <w:t>Confidential Information of the Disclosing Party will not include information that the Disclosing Party can demonstrate by reasonable evidence (a) is in or enters the public domain without breach of this Agreement, (b) the Receiving Party lawfully receives from a third party without restriction on disclosure and without breach of a nondisclosure obligation, (c) is approved for release by written authorization of the Disclosing Party, (d) the Receiving Party knew prior to receiving such information from the Disclosing Party or (e) is independently developed by the Receiving Party without reference to Confidential Information of the Disclosing Party.</w:t>
-      </w:r>
-      <w:r>
-        <w:rPr>
-          <w:sz w:val="12"/>
-        </w:rPr>
-        <w:t xml:space="preserve"> </w:t>
-      </w:r>
-      <w:r>
-        <w:rPr>
-          <w:color w:val="FF0000"/>
-          <w:sz w:val="12"/>
-        </w:rPr>
-        <w:t>Confidential Information shall be returned only after a written request is submitted and approved by the Disclosing Party's legal department, bypassing the procedures outlined in Section 11.</w:t>
+        <w:t>Confidential Information of the Disclosing Party will not include information</w:t>
+      </w:r>
+      <w:r>
+        <w:rPr>
+          <w:spacing w:val="18"/>
+          <w:sz w:val="12"/>
+        </w:rPr>
+        <w:t> </w:t>
+      </w:r>
+      <w:r>
+        <w:rPr>
+          <w:sz w:val="12"/>
+        </w:rPr>
+        <w:t>that</w:t>
+      </w:r>
+      <w:r>
+        <w:rPr>
+          <w:spacing w:val="18"/>
+          <w:sz w:val="12"/>
+        </w:rPr>
+        <w:t> </w:t>
+      </w:r>
+      <w:r>
+        <w:rPr>
+          <w:sz w:val="12"/>
+        </w:rPr>
+        <w:t>the</w:t>
+      </w:r>
+      <w:r>
+        <w:rPr>
+          <w:spacing w:val="18"/>
+          <w:sz w:val="12"/>
+        </w:rPr>
+        <w:t> </w:t>
+      </w:r>
+      <w:r>
+        <w:rPr>
+          <w:sz w:val="12"/>
+        </w:rPr>
+        <w:t>Disclosing</w:t>
+      </w:r>
+      <w:r>
+        <w:rPr>
+          <w:spacing w:val="18"/>
+          <w:sz w:val="12"/>
+        </w:rPr>
+        <w:t> </w:t>
+      </w:r>
+      <w:r>
+        <w:rPr>
+          <w:sz w:val="12"/>
+        </w:rPr>
+        <w:t>Party</w:t>
+      </w:r>
+      <w:r>
+        <w:rPr>
+          <w:spacing w:val="18"/>
+          <w:sz w:val="12"/>
+        </w:rPr>
+        <w:t> </w:t>
+      </w:r>
+      <w:r>
+        <w:rPr>
+          <w:sz w:val="12"/>
+        </w:rPr>
+        <w:t>can</w:t>
+      </w:r>
+      <w:r>
+        <w:rPr>
+          <w:spacing w:val="18"/>
+          <w:sz w:val="12"/>
+        </w:rPr>
+        <w:t> </w:t>
+      </w:r>
+      <w:r>
+        <w:rPr>
+          <w:sz w:val="12"/>
+        </w:rPr>
+        <w:t>demonstrate</w:t>
+      </w:r>
+      <w:r>
+        <w:rPr>
+          <w:spacing w:val="18"/>
+          <w:sz w:val="12"/>
+        </w:rPr>
+        <w:t> </w:t>
+      </w:r>
+      <w:r>
+        <w:rPr>
+          <w:sz w:val="12"/>
+        </w:rPr>
+        <w:t>by</w:t>
+      </w:r>
+      <w:r>
+        <w:rPr>
+          <w:spacing w:val="18"/>
+          <w:sz w:val="12"/>
+        </w:rPr>
+        <w:t> </w:t>
+      </w:r>
+      <w:r>
+        <w:rPr>
+          <w:sz w:val="12"/>
+        </w:rPr>
+        <w:t>reasonable</w:t>
+      </w:r>
+      <w:r>
+        <w:rPr>
+          <w:spacing w:val="18"/>
+          <w:sz w:val="12"/>
+        </w:rPr>
+        <w:t> </w:t>
+      </w:r>
+      <w:r>
+        <w:rPr>
+          <w:sz w:val="12"/>
+        </w:rPr>
+        <w:t>evidence</w:t>
+      </w:r>
+      <w:r>
+        <w:rPr>
+          <w:spacing w:val="18"/>
+          <w:sz w:val="12"/>
+        </w:rPr>
+        <w:t> </w:t>
+      </w:r>
+      <w:r>
+        <w:rPr>
+          <w:sz w:val="12"/>
+        </w:rPr>
+        <w:t>(a) is in or enters the public domain without breach of this Agreement, (b) the Receiving Party lawfully receives from a third party without restriction on disclosure and without breach of a nondisclosure obligation, (c) is approved for release</w:t>
+      </w:r>
+      <w:r>
+        <w:rPr>
+          <w:spacing w:val="25"/>
+          <w:sz w:val="12"/>
+        </w:rPr>
+        <w:t> </w:t>
+      </w:r>
+      <w:r>
+        <w:rPr>
+          <w:sz w:val="12"/>
+        </w:rPr>
+        <w:t>by</w:t>
+      </w:r>
+      <w:r>
+        <w:rPr>
+          <w:spacing w:val="25"/>
+          <w:sz w:val="12"/>
+        </w:rPr>
+        <w:t> </w:t>
+      </w:r>
+      <w:r>
+        <w:rPr>
+          <w:sz w:val="12"/>
+        </w:rPr>
+        <w:t>written</w:t>
+      </w:r>
+      <w:r>
+        <w:rPr>
+          <w:spacing w:val="25"/>
+          <w:sz w:val="12"/>
+        </w:rPr>
+        <w:t> </w:t>
+      </w:r>
+      <w:r>
+        <w:rPr>
+          <w:sz w:val="12"/>
+        </w:rPr>
+        <w:t>authorization</w:t>
+      </w:r>
+      <w:r>
+        <w:rPr>
+          <w:spacing w:val="25"/>
+          <w:sz w:val="12"/>
+        </w:rPr>
+        <w:t> </w:t>
+      </w:r>
+      <w:r>
+        <w:rPr>
+          <w:sz w:val="12"/>
+        </w:rPr>
+        <w:t>of</w:t>
+      </w:r>
+      <w:r>
+        <w:rPr>
+          <w:spacing w:val="25"/>
+          <w:sz w:val="12"/>
+        </w:rPr>
+        <w:t> </w:t>
+      </w:r>
+      <w:r>
+        <w:rPr>
+          <w:sz w:val="12"/>
+        </w:rPr>
+        <w:t>the</w:t>
+      </w:r>
+      <w:r>
+        <w:rPr>
+          <w:spacing w:val="25"/>
+          <w:sz w:val="12"/>
+        </w:rPr>
+        <w:t> </w:t>
+      </w:r>
+      <w:r>
+        <w:rPr>
+          <w:sz w:val="12"/>
+        </w:rPr>
+        <w:t>Disclosing</w:t>
+      </w:r>
+      <w:r>
+        <w:rPr>
+          <w:spacing w:val="25"/>
+          <w:sz w:val="12"/>
+        </w:rPr>
+        <w:t> </w:t>
+      </w:r>
+      <w:r>
+        <w:rPr>
+          <w:sz w:val="12"/>
+        </w:rPr>
+        <w:t>Party,</w:t>
+      </w:r>
+      <w:r>
+        <w:rPr>
+          <w:spacing w:val="25"/>
+          <w:sz w:val="12"/>
+        </w:rPr>
+        <w:t> </w:t>
+      </w:r>
+      <w:r>
+        <w:rPr>
+          <w:sz w:val="12"/>
+        </w:rPr>
+        <w:t>(d)</w:t>
+      </w:r>
+      <w:r>
+        <w:rPr>
+          <w:spacing w:val="25"/>
+          <w:sz w:val="12"/>
+        </w:rPr>
+        <w:t> </w:t>
+      </w:r>
+      <w:r>
+        <w:rPr>
+          <w:sz w:val="12"/>
+        </w:rPr>
+        <w:t>the</w:t>
+      </w:r>
+      <w:r>
+        <w:rPr>
+          <w:spacing w:val="25"/>
+          <w:sz w:val="12"/>
+        </w:rPr>
+        <w:t> </w:t>
+      </w:r>
+      <w:r>
+        <w:rPr>
+          <w:sz w:val="12"/>
+        </w:rPr>
+        <w:t>Receiving Party</w:t>
+      </w:r>
+      <w:r>
+        <w:rPr>
+          <w:spacing w:val="21"/>
+          <w:sz w:val="12"/>
+        </w:rPr>
+        <w:t> </w:t>
+      </w:r>
+      <w:r>
+        <w:rPr>
+          <w:sz w:val="12"/>
+        </w:rPr>
+        <w:t>knew</w:t>
+      </w:r>
+      <w:r>
+        <w:rPr>
+          <w:spacing w:val="21"/>
+          <w:sz w:val="12"/>
+        </w:rPr>
+        <w:t> </w:t>
+      </w:r>
+      <w:r>
+        <w:rPr>
+          <w:sz w:val="12"/>
+        </w:rPr>
+        <w:t>prior</w:t>
+      </w:r>
+      <w:r>
+        <w:rPr>
+          <w:spacing w:val="21"/>
+          <w:sz w:val="12"/>
+        </w:rPr>
+        <w:t> </w:t>
+      </w:r>
+      <w:r>
+        <w:rPr>
+          <w:sz w:val="12"/>
+        </w:rPr>
+        <w:t>to</w:t>
+      </w:r>
+      <w:r>
+        <w:rPr>
+          <w:spacing w:val="21"/>
+          <w:sz w:val="12"/>
+        </w:rPr>
+        <w:t> </w:t>
+      </w:r>
+      <w:r>
+        <w:rPr>
+          <w:sz w:val="12"/>
+        </w:rPr>
+        <w:t>receiving</w:t>
+      </w:r>
+      <w:r>
+        <w:rPr>
+          <w:spacing w:val="21"/>
+          <w:sz w:val="12"/>
+        </w:rPr>
+        <w:t> </w:t>
+      </w:r>
+      <w:r>
+        <w:rPr>
+          <w:sz w:val="12"/>
+        </w:rPr>
+        <w:t>such</w:t>
+      </w:r>
+      <w:r>
+        <w:rPr>
+          <w:spacing w:val="21"/>
+          <w:sz w:val="12"/>
+        </w:rPr>
+        <w:t> </w:t>
+      </w:r>
+      <w:r>
+        <w:rPr>
+          <w:sz w:val="12"/>
+        </w:rPr>
+        <w:t>information</w:t>
+      </w:r>
+      <w:r>
+        <w:rPr>
+          <w:spacing w:val="21"/>
+          <w:sz w:val="12"/>
+        </w:rPr>
+        <w:t> </w:t>
+      </w:r>
+      <w:r>
+        <w:rPr>
+          <w:sz w:val="12"/>
+        </w:rPr>
+        <w:t>from</w:t>
+      </w:r>
+      <w:r>
+        <w:rPr>
+          <w:spacing w:val="21"/>
+          <w:sz w:val="12"/>
+        </w:rPr>
+        <w:t> </w:t>
+      </w:r>
+      <w:r>
+        <w:rPr>
+          <w:sz w:val="12"/>
+        </w:rPr>
+        <w:t>the</w:t>
+      </w:r>
+      <w:r>
+        <w:rPr>
+          <w:spacing w:val="21"/>
+          <w:sz w:val="12"/>
+        </w:rPr>
+        <w:t> </w:t>
+      </w:r>
+      <w:r>
+        <w:rPr>
+          <w:sz w:val="12"/>
+        </w:rPr>
+        <w:t>Disclosing</w:t>
+      </w:r>
+      <w:r>
+        <w:rPr>
+          <w:spacing w:val="21"/>
+          <w:sz w:val="12"/>
+        </w:rPr>
+        <w:t> </w:t>
+      </w:r>
+      <w:r>
+        <w:rPr>
+          <w:sz w:val="12"/>
+        </w:rPr>
+        <w:t>Party</w:t>
+      </w:r>
+      <w:r>
+        <w:rPr>
+          <w:spacing w:val="21"/>
+          <w:sz w:val="12"/>
+        </w:rPr>
+        <w:t> </w:t>
+      </w:r>
+      <w:r>
+        <w:rPr>
+          <w:sz w:val="12"/>
+        </w:rPr>
+        <w:t>or</w:t>
+      </w:r>
+      <w:r>
+        <w:rPr>
+          <w:spacing w:val="21"/>
+          <w:sz w:val="12"/>
+        </w:rPr>
+        <w:t> </w:t>
+      </w:r>
+      <w:r>
+        <w:rPr>
+          <w:sz w:val="12"/>
+        </w:rPr>
+        <w:t>(e) is</w:t>
+      </w:r>
+      <w:r>
+        <w:rPr>
+          <w:spacing w:val="26"/>
+          <w:sz w:val="12"/>
+        </w:rPr>
+        <w:t> </w:t>
+      </w:r>
+      <w:r>
+        <w:rPr>
+          <w:sz w:val="12"/>
+        </w:rPr>
+        <w:t>independently</w:t>
+      </w:r>
+      <w:r>
+        <w:rPr>
+          <w:spacing w:val="26"/>
+          <w:sz w:val="12"/>
+        </w:rPr>
+        <w:t> </w:t>
+      </w:r>
+      <w:r>
+        <w:rPr>
+          <w:sz w:val="12"/>
+        </w:rPr>
+        <w:t>developed</w:t>
+      </w:r>
+      <w:r>
+        <w:rPr>
+          <w:spacing w:val="26"/>
+          <w:sz w:val="12"/>
+        </w:rPr>
+        <w:t> </w:t>
+      </w:r>
+      <w:r>
+        <w:rPr>
+          <w:sz w:val="12"/>
+        </w:rPr>
+        <w:t>by</w:t>
+      </w:r>
+      <w:r>
+        <w:rPr>
+          <w:spacing w:val="26"/>
+          <w:sz w:val="12"/>
+        </w:rPr>
+        <w:t> </w:t>
+      </w:r>
+      <w:r>
+        <w:rPr>
+          <w:sz w:val="12"/>
+        </w:rPr>
+        <w:t>the</w:t>
+      </w:r>
+      <w:r>
+        <w:rPr>
+          <w:spacing w:val="26"/>
+          <w:sz w:val="12"/>
+        </w:rPr>
+        <w:t> </w:t>
+      </w:r>
+      <w:r>
+        <w:rPr>
+          <w:sz w:val="12"/>
+        </w:rPr>
+        <w:t>Receiving</w:t>
+      </w:r>
+      <w:r>
+        <w:rPr>
+          <w:spacing w:val="26"/>
+          <w:sz w:val="12"/>
+        </w:rPr>
+        <w:t> </w:t>
+      </w:r>
+      <w:r>
+        <w:rPr>
+          <w:sz w:val="12"/>
+        </w:rPr>
+        <w:t>Party</w:t>
+      </w:r>
+      <w:r>
+        <w:rPr>
+          <w:spacing w:val="26"/>
+          <w:sz w:val="12"/>
+        </w:rPr>
+        <w:t> </w:t>
+      </w:r>
+      <w:r>
+        <w:rPr>
+          <w:sz w:val="12"/>
+        </w:rPr>
+        <w:t>without</w:t>
+      </w:r>
+      <w:r>
+        <w:rPr>
+          <w:spacing w:val="26"/>
+          <w:sz w:val="12"/>
+        </w:rPr>
+        <w:t> </w:t>
+      </w:r>
+      <w:r>
+        <w:rPr>
+          <w:sz w:val="12"/>
+        </w:rPr>
+        <w:t>reference</w:t>
+      </w:r>
+      <w:r>
+        <w:rPr>
+          <w:spacing w:val="26"/>
+          <w:sz w:val="12"/>
+        </w:rPr>
+        <w:t> </w:t>
+      </w:r>
+      <w:r>
+        <w:rPr>
+          <w:sz w:val="12"/>
+        </w:rPr>
+        <w:t>to Confidential Information of the Disclosing Party.</w:t>
       </w:r>
     </w:p>
     <w:p>
@@ -24233,20 +24043,488 @@
         <w:rPr>
           <w:sz w:val="12"/>
         </w:rPr>
-        <w:t>the eDiets Content may be used by Women.com as permitted by this Agreement without violating or infringing the rights of any person or entity, including, without limitation, rights of privacy or publicity, contractual rights, copyright, trademark, or other Intellectual Property rights;</w:t>
-      </w:r>
-      <w:r>
-        <w:rPr>
-          <w:sz w:val="12"/>
-        </w:rPr>
-        <w:t xml:space="preserve"> </w:t>
-      </w:r>
-      <w:r>
-        <w:rPr>
-          <w:color w:val="FF0000"/>
-          <w:sz w:val="12"/>
-        </w:rPr>
-        <w:t>eDiets, in its sole discretion, may withdraw specific or general permission to use the Women.com Marks upon seventy-two (72) hours written notice to Women.com.</w:t>
+        <w:t>the</w:t>
+      </w:r>
+      <w:r>
+        <w:rPr>
+          <w:spacing w:val="22"/>
+          <w:sz w:val="12"/>
+        </w:rPr>
+        <w:t> </w:t>
+      </w:r>
+      <w:r>
+        <w:rPr>
+          <w:sz w:val="12"/>
+        </w:rPr>
+        <w:t>eDiets</w:t>
+      </w:r>
+      <w:r>
+        <w:rPr>
+          <w:spacing w:val="22"/>
+          <w:sz w:val="12"/>
+        </w:rPr>
+        <w:t> </w:t>
+      </w:r>
+      <w:r>
+        <w:rPr>
+          <w:sz w:val="12"/>
+        </w:rPr>
+        <w:t>Content</w:t>
+      </w:r>
+      <w:r>
+        <w:rPr>
+          <w:spacing w:val="22"/>
+          <w:sz w:val="12"/>
+        </w:rPr>
+        <w:t> </w:t>
+      </w:r>
+      <w:r>
+        <w:rPr>
+          <w:sz w:val="12"/>
+        </w:rPr>
+        <w:t>may</w:t>
+      </w:r>
+      <w:r>
+        <w:rPr>
+          <w:spacing w:val="22"/>
+          <w:sz w:val="12"/>
+        </w:rPr>
+        <w:t> </w:t>
+      </w:r>
+      <w:r>
+        <w:rPr>
+          <w:sz w:val="12"/>
+        </w:rPr>
+        <w:t>be</w:t>
+      </w:r>
+      <w:r>
+        <w:rPr>
+          <w:spacing w:val="22"/>
+          <w:sz w:val="12"/>
+        </w:rPr>
+        <w:t> </w:t>
+      </w:r>
+      <w:r>
+        <w:rPr>
+          <w:sz w:val="12"/>
+        </w:rPr>
+        <w:t>used</w:t>
+      </w:r>
+      <w:r>
+        <w:rPr>
+          <w:spacing w:val="22"/>
+          <w:sz w:val="12"/>
+        </w:rPr>
+        <w:t> </w:t>
+      </w:r>
+      <w:r>
+        <w:rPr>
+          <w:sz w:val="12"/>
+        </w:rPr>
+        <w:t>by</w:t>
+      </w:r>
+      <w:r>
+        <w:rPr>
+          <w:spacing w:val="22"/>
+          <w:sz w:val="12"/>
+        </w:rPr>
+        <w:t> </w:t>
+      </w:r>
+      <w:r>
+        <w:rPr>
+          <w:sz w:val="12"/>
+        </w:rPr>
+        <w:t>Women.com</w:t>
+      </w:r>
+      <w:r>
+        <w:rPr>
+          <w:spacing w:val="22"/>
+          <w:sz w:val="12"/>
+        </w:rPr>
+        <w:t> </w:t>
+      </w:r>
+      <w:r>
+        <w:rPr>
+          <w:sz w:val="12"/>
+        </w:rPr>
+        <w:t>as</w:t>
+      </w:r>
+      <w:r>
+        <w:rPr>
+          <w:spacing w:val="22"/>
+          <w:sz w:val="12"/>
+        </w:rPr>
+        <w:t> </w:t>
+      </w:r>
+      <w:r>
+        <w:rPr>
+          <w:sz w:val="12"/>
+        </w:rPr>
+        <w:t>permitted</w:t>
+      </w:r>
+      <w:r>
+        <w:rPr>
+          <w:spacing w:val="22"/>
+          <w:sz w:val="12"/>
+        </w:rPr>
+        <w:t> </w:t>
+      </w:r>
+      <w:r>
+        <w:rPr>
+          <w:sz w:val="12"/>
+        </w:rPr>
+        <w:t>by this</w:t>
+      </w:r>
+      <w:r>
+        <w:rPr>
+          <w:spacing w:val="22"/>
+          <w:sz w:val="12"/>
+        </w:rPr>
+        <w:t> </w:t>
+      </w:r>
+      <w:r>
+        <w:rPr>
+          <w:sz w:val="12"/>
+        </w:rPr>
+        <w:t>Agreement</w:t>
+      </w:r>
+      <w:r>
+        <w:rPr>
+          <w:spacing w:val="22"/>
+          <w:sz w:val="12"/>
+        </w:rPr>
+        <w:t> </w:t>
+      </w:r>
+      <w:r>
+        <w:rPr>
+          <w:sz w:val="12"/>
+        </w:rPr>
+        <w:t>without</w:t>
+      </w:r>
+      <w:r>
+        <w:rPr>
+          <w:spacing w:val="22"/>
+          <w:sz w:val="12"/>
+        </w:rPr>
+        <w:t> </w:t>
+      </w:r>
+      <w:r>
+        <w:rPr>
+          <w:sz w:val="12"/>
+        </w:rPr>
+        <w:t>violating</w:t>
+      </w:r>
+      <w:r>
+        <w:rPr>
+          <w:spacing w:val="22"/>
+          <w:sz w:val="12"/>
+        </w:rPr>
+        <w:t> </w:t>
+      </w:r>
+      <w:r>
+        <w:rPr>
+          <w:sz w:val="12"/>
+        </w:rPr>
+        <w:t>or</w:t>
+      </w:r>
+      <w:r>
+        <w:rPr>
+          <w:spacing w:val="22"/>
+          <w:sz w:val="12"/>
+        </w:rPr>
+        <w:t> </w:t>
+      </w:r>
+      <w:r>
+        <w:rPr>
+          <w:sz w:val="12"/>
+        </w:rPr>
+        <w:t>infringing</w:t>
+      </w:r>
+      <w:r>
+        <w:rPr>
+          <w:spacing w:val="22"/>
+          <w:sz w:val="12"/>
+        </w:rPr>
+        <w:t> </w:t>
+      </w:r>
+      <w:r>
+        <w:rPr>
+          <w:sz w:val="12"/>
+        </w:rPr>
+        <w:t>the</w:t>
+      </w:r>
+      <w:r>
+        <w:rPr>
+          <w:spacing w:val="22"/>
+          <w:sz w:val="12"/>
+        </w:rPr>
+        <w:t> </w:t>
+      </w:r>
+      <w:r>
+        <w:rPr>
+          <w:sz w:val="12"/>
+        </w:rPr>
+        <w:t>rights</w:t>
+      </w:r>
+      <w:r>
+        <w:rPr>
+          <w:spacing w:val="22"/>
+          <w:sz w:val="12"/>
+        </w:rPr>
+        <w:t> </w:t>
+      </w:r>
+      <w:r>
+        <w:rPr>
+          <w:sz w:val="12"/>
+        </w:rPr>
+        <w:t>of</w:t>
+      </w:r>
+      <w:r>
+        <w:rPr>
+          <w:spacing w:val="22"/>
+          <w:sz w:val="12"/>
+        </w:rPr>
+        <w:t> </w:t>
+      </w:r>
+      <w:r>
+        <w:rPr>
+          <w:sz w:val="12"/>
+        </w:rPr>
+        <w:t>any</w:t>
+      </w:r>
+      <w:r>
+        <w:rPr>
+          <w:spacing w:val="22"/>
+          <w:sz w:val="12"/>
+        </w:rPr>
+        <w:t> </w:t>
+      </w:r>
+      <w:r>
+        <w:rPr>
+          <w:sz w:val="12"/>
+        </w:rPr>
+        <w:t>person</w:t>
+      </w:r>
+      <w:r>
+        <w:rPr>
+          <w:spacing w:val="22"/>
+          <w:sz w:val="12"/>
+        </w:rPr>
+        <w:t> </w:t>
+      </w:r>
+      <w:r>
+        <w:rPr>
+          <w:sz w:val="12"/>
+        </w:rPr>
+        <w:t>or entity,</w:t>
+      </w:r>
+      <w:r>
+        <w:rPr>
+          <w:spacing w:val="30"/>
+          <w:sz w:val="12"/>
+        </w:rPr>
+        <w:t> </w:t>
+      </w:r>
+      <w:r>
+        <w:rPr>
+          <w:sz w:val="12"/>
+        </w:rPr>
+        <w:t>including,</w:t>
+      </w:r>
+      <w:r>
+        <w:rPr>
+          <w:spacing w:val="30"/>
+          <w:sz w:val="12"/>
+        </w:rPr>
+        <w:t> </w:t>
+      </w:r>
+      <w:r>
+        <w:rPr>
+          <w:sz w:val="12"/>
+        </w:rPr>
+        <w:t>without</w:t>
+      </w:r>
+      <w:r>
+        <w:rPr>
+          <w:spacing w:val="30"/>
+          <w:sz w:val="12"/>
+        </w:rPr>
+        <w:t> </w:t>
+      </w:r>
+      <w:r>
+        <w:rPr>
+          <w:sz w:val="12"/>
+        </w:rPr>
+        <w:t>limitation,</w:t>
+      </w:r>
+      <w:r>
+        <w:rPr>
+          <w:spacing w:val="30"/>
+          <w:sz w:val="12"/>
+        </w:rPr>
+        <w:t> </w:t>
+      </w:r>
+      <w:r>
+        <w:rPr>
+          <w:sz w:val="12"/>
+        </w:rPr>
+        <w:t>rights</w:t>
+      </w:r>
+      <w:r>
+        <w:rPr>
+          <w:spacing w:val="30"/>
+          <w:sz w:val="12"/>
+        </w:rPr>
+        <w:t> </w:t>
+      </w:r>
+      <w:r>
+        <w:rPr>
+          <w:sz w:val="12"/>
+        </w:rPr>
+        <w:t>of</w:t>
+      </w:r>
+      <w:r>
+        <w:rPr>
+          <w:spacing w:val="30"/>
+          <w:sz w:val="12"/>
+        </w:rPr>
+        <w:t> </w:t>
+      </w:r>
+      <w:r>
+        <w:rPr>
+          <w:sz w:val="12"/>
+        </w:rPr>
+        <w:t>privacy</w:t>
+      </w:r>
+      <w:r>
+        <w:rPr>
+          <w:spacing w:val="30"/>
+          <w:sz w:val="12"/>
+        </w:rPr>
+        <w:t> </w:t>
+      </w:r>
+      <w:r>
+        <w:rPr>
+          <w:sz w:val="12"/>
+        </w:rPr>
+        <w:t>or</w:t>
+      </w:r>
+      <w:r>
+        <w:rPr>
+          <w:spacing w:val="30"/>
+          <w:sz w:val="12"/>
+        </w:rPr>
+        <w:t> </w:t>
+      </w:r>
+      <w:r>
+        <w:rPr>
+          <w:sz w:val="12"/>
+        </w:rPr>
+        <w:t>publicity, contractual</w:t>
+      </w:r>
+      <w:r>
+        <w:rPr>
+          <w:spacing w:val="23"/>
+          <w:sz w:val="12"/>
+        </w:rPr>
+        <w:t> </w:t>
+      </w:r>
+      <w:r>
+        <w:rPr>
+          <w:sz w:val="12"/>
+        </w:rPr>
+        <w:t>rights,</w:t>
+      </w:r>
+      <w:r>
+        <w:rPr>
+          <w:spacing w:val="23"/>
+          <w:sz w:val="12"/>
+        </w:rPr>
+        <w:t> </w:t>
+      </w:r>
+      <w:r>
+        <w:rPr>
+          <w:sz w:val="12"/>
+        </w:rPr>
+        <w:t>copyright,</w:t>
+      </w:r>
+      <w:r>
+        <w:rPr>
+          <w:spacing w:val="23"/>
+          <w:sz w:val="12"/>
+        </w:rPr>
+        <w:t> </w:t>
+      </w:r>
+      <w:r>
+        <w:rPr>
+          <w:sz w:val="12"/>
+        </w:rPr>
+        <w:t>trademark,</w:t>
+      </w:r>
+      <w:r>
+        <w:rPr>
+          <w:spacing w:val="23"/>
+          <w:sz w:val="12"/>
+        </w:rPr>
+        <w:t> </w:t>
+      </w:r>
+      <w:r>
+        <w:rPr>
+          <w:sz w:val="12"/>
+        </w:rPr>
+        <w:t>or</w:t>
+      </w:r>
+      <w:r>
+        <w:rPr>
+          <w:spacing w:val="23"/>
+          <w:sz w:val="12"/>
+        </w:rPr>
+        <w:t> </w:t>
+      </w:r>
+      <w:r>
+        <w:rPr>
+          <w:sz w:val="12"/>
+        </w:rPr>
+        <w:t>other</w:t>
+      </w:r>
+      <w:r>
+        <w:rPr>
+          <w:spacing w:val="23"/>
+          <w:sz w:val="12"/>
+        </w:rPr>
+        <w:t> </w:t>
+      </w:r>
+      <w:r>
+        <w:rPr>
+          <w:sz w:val="12"/>
+        </w:rPr>
+        <w:t>Intellectual</w:t>
+      </w:r>
+      <w:r>
+        <w:rPr>
+          <w:spacing w:val="23"/>
+          <w:sz w:val="12"/>
+        </w:rPr>
+        <w:t> </w:t>
+      </w:r>
+      <w:r>
+        <w:rPr>
+          <w:sz w:val="12"/>
+        </w:rPr>
+        <w:t>Property</w:t>
+      </w:r>
+      <w:r>
+        <w:rPr>
+          <w:spacing w:val="23"/>
+          <w:sz w:val="12"/>
+        </w:rPr>
+        <w:t> </w:t>
+      </w:r>
+      <w:r>
+        <w:rPr>
+          <w:sz w:val="12"/>
+        </w:rPr>
+        <w:t>rights;</w:t>
       </w:r>
     </w:p>
     <w:p>
@@ -24313,20 +24591,150 @@
         <w:rPr>
           <w:sz w:val="12"/>
         </w:rPr>
-        <w:t>the use of the eDiets Marks by Women.com as permitted by this Agreement will not infringe or violate the trademark, service mark or trade dress rights of any Person; and</w:t>
-      </w:r>
-      <w:r>
-        <w:rPr>
-          <w:sz w:val="12"/>
-        </w:rPr>
-        <w:t xml:space="preserve"> </w:t>
-      </w:r>
-      <w:r>
-        <w:rPr>
-          <w:color w:val="FF0000"/>
-          <w:sz w:val="12"/>
-        </w:rPr>
-        <w:t>the use of the eDiets Marks by Women.com as permitted by this Agreement may infringe or violate the trademark, service mark or trade dress rights of any Person;</w:t>
+        <w:t>the use of the eDiets Marks by Women.com as permitted by this Agreement</w:t>
+      </w:r>
+      <w:r>
+        <w:rPr>
+          <w:spacing w:val="23"/>
+          <w:sz w:val="12"/>
+        </w:rPr>
+        <w:t> </w:t>
+      </w:r>
+      <w:r>
+        <w:rPr>
+          <w:sz w:val="12"/>
+        </w:rPr>
+        <w:t>will</w:t>
+      </w:r>
+      <w:r>
+        <w:rPr>
+          <w:spacing w:val="23"/>
+          <w:sz w:val="12"/>
+        </w:rPr>
+        <w:t> </w:t>
+      </w:r>
+      <w:r>
+        <w:rPr>
+          <w:sz w:val="12"/>
+        </w:rPr>
+        <w:t>not</w:t>
+      </w:r>
+      <w:r>
+        <w:rPr>
+          <w:spacing w:val="23"/>
+          <w:sz w:val="12"/>
+        </w:rPr>
+        <w:t> </w:t>
+      </w:r>
+      <w:r>
+        <w:rPr>
+          <w:sz w:val="12"/>
+        </w:rPr>
+        <w:t>infringe</w:t>
+      </w:r>
+      <w:r>
+        <w:rPr>
+          <w:spacing w:val="23"/>
+          <w:sz w:val="12"/>
+        </w:rPr>
+        <w:t> </w:t>
+      </w:r>
+      <w:r>
+        <w:rPr>
+          <w:sz w:val="12"/>
+        </w:rPr>
+        <w:t>or</w:t>
+      </w:r>
+      <w:r>
+        <w:rPr>
+          <w:spacing w:val="23"/>
+          <w:sz w:val="12"/>
+        </w:rPr>
+        <w:t> </w:t>
+      </w:r>
+      <w:r>
+        <w:rPr>
+          <w:sz w:val="12"/>
+        </w:rPr>
+        <w:t>violate</w:t>
+      </w:r>
+      <w:r>
+        <w:rPr>
+          <w:spacing w:val="23"/>
+          <w:sz w:val="12"/>
+        </w:rPr>
+        <w:t> </w:t>
+      </w:r>
+      <w:r>
+        <w:rPr>
+          <w:sz w:val="12"/>
+        </w:rPr>
+        <w:t>the</w:t>
+      </w:r>
+      <w:r>
+        <w:rPr>
+          <w:spacing w:val="23"/>
+          <w:sz w:val="12"/>
+        </w:rPr>
+        <w:t> </w:t>
+      </w:r>
+      <w:r>
+        <w:rPr>
+          <w:sz w:val="12"/>
+        </w:rPr>
+        <w:t>trademark,</w:t>
+      </w:r>
+      <w:r>
+        <w:rPr>
+          <w:spacing w:val="23"/>
+          <w:sz w:val="12"/>
+        </w:rPr>
+        <w:t> </w:t>
+      </w:r>
+      <w:r>
+        <w:rPr>
+          <w:sz w:val="12"/>
+        </w:rPr>
+        <w:t>service</w:t>
+      </w:r>
+      <w:r>
+        <w:rPr>
+          <w:spacing w:val="23"/>
+          <w:sz w:val="12"/>
+        </w:rPr>
+        <w:t> </w:t>
+      </w:r>
+      <w:r>
+        <w:rPr>
+          <w:sz w:val="12"/>
+        </w:rPr>
+        <w:t>mark</w:t>
+      </w:r>
+      <w:r>
+        <w:rPr>
+          <w:spacing w:val="23"/>
+          <w:sz w:val="12"/>
+        </w:rPr>
+        <w:t> </w:t>
+      </w:r>
+      <w:r>
+        <w:rPr>
+          <w:sz w:val="12"/>
+        </w:rPr>
+        <w:t>or</w:t>
+      </w:r>
+      <w:r>
+        <w:rPr>
+          <w:spacing w:val="23"/>
+          <w:sz w:val="12"/>
+        </w:rPr>
+        <w:t> </w:t>
+      </w:r>
+      <w:r>
+        <w:rPr>
+          <w:sz w:val="12"/>
+        </w:rPr>
+        <w:t>trade dress rights of any Person; and</w:t>
       </w:r>
     </w:p>
     <w:p>
@@ -26675,117 +27083,13 @@
       </w:pPr>
       <w:r>
         <w:rPr/>
-        <w:t>against all Indemnifiable Sums arising out of third party claims to the extent such claims are based upon: (a) content published on the Women.com Sites, other than</w:t>
-      </w:r>
-      <w:r>
-        <w:rPr>
-          <w:spacing w:val="23"/>
-        </w:rPr>
-        <w:t> </w:t>
-      </w:r>
-      <w:r>
-        <w:rPr/>
-        <w:t>eDiets</w:t>
-      </w:r>
-      <w:r>
-        <w:rPr>
-          <w:spacing w:val="23"/>
-        </w:rPr>
-        <w:t> </w:t>
-      </w:r>
-      <w:r>
-        <w:rPr/>
-        <w:t>Content;</w:t>
-      </w:r>
-      <w:r>
-        <w:rPr>
-          <w:spacing w:val="23"/>
-        </w:rPr>
-        <w:t> </w:t>
-      </w:r>
-      <w:r>
-        <w:rPr/>
-        <w:t>(b)</w:t>
-      </w:r>
-      <w:r>
-        <w:rPr>
-          <w:spacing w:val="23"/>
-        </w:rPr>
-        <w:t> </w:t>
-      </w:r>
-      <w:r>
-        <w:rPr/>
-        <w:t>the</w:t>
-      </w:r>
-      <w:r>
-        <w:rPr>
-          <w:spacing w:val="23"/>
-        </w:rPr>
-        <w:t> </w:t>
-      </w:r>
-      <w:r>
-        <w:rPr/>
-        <w:t>operation</w:t>
-      </w:r>
-      <w:r>
-        <w:rPr>
-          <w:spacing w:val="23"/>
-        </w:rPr>
-        <w:t> </w:t>
-      </w:r>
-      <w:r>
-        <w:rPr/>
-        <w:t>of</w:t>
-      </w:r>
-      <w:r>
-        <w:rPr>
-          <w:spacing w:val="23"/>
-        </w:rPr>
-        <w:t> </w:t>
-      </w:r>
-      <w:r>
-        <w:rPr/>
-        <w:t>the</w:t>
-      </w:r>
-      <w:r>
-        <w:rPr>
-          <w:spacing w:val="23"/>
-        </w:rPr>
-        <w:t> </w:t>
-      </w:r>
-      <w:r>
-        <w:rPr/>
-        <w:t>Women.com</w:t>
-      </w:r>
-      <w:r>
-        <w:rPr>
-          <w:spacing w:val="23"/>
-        </w:rPr>
-        <w:t> </w:t>
-      </w:r>
-      <w:r>
-        <w:rPr/>
-        <w:t>membership</w:t>
-      </w:r>
-      <w:r>
-        <w:rPr>
-          <w:spacing w:val="23"/>
-        </w:rPr>
-        <w:t> </w:t>
-      </w:r>
-      <w:r>
-        <w:rPr/>
-        <w:t>program;</w:t>
-      </w:r>
-      <w:r>
-        <w:rPr>
-          <w:spacing w:val="23"/>
-        </w:rPr>
-        <w:t> </w:t>
-      </w:r>
-      <w:r>
-        <w:rPr/>
-        <w:t>or</w:t>
+        <w:t>against all Indemnifiable Sums arising out of third party claims to the extent such claims are based upon: (a) content published on the Women.com Sites, other than eDiets Content; (b) the operation of the Women.com membership program; or</w:t>
+      </w:r>
+      <w:r>
+        <w:rPr>
+          <w:color w:val="FF0000"/>
+        </w:rPr>
+        <w:t>Each party agrees that the sole and exclusive remedy for a breach of the warranties set forth in this Section 12 shall be pursued through arbitration prior to seeking the indemnification set forth in Section 13 below.</w:t>
       </w:r>
     </w:p>
     <w:p>

</xml_diff>